<commit_message>
Update Slides Set 8
</commit_message>
<xml_diff>
--- a/class08w.docx
+++ b/class08w.docx
@@ -9733,7 +9733,7 @@
         <w:rPr>
           <w:rStyle w:val="FunctionTok"/>
         </w:rPr>
-        <w:t xml:space="preserve">lm</w:t>
+        <w:t xml:space="preserve">stan_glm</w:t>
       </w:r>
       <w:r>
         <w:rPr>
@@ -9760,7 +9760,7 @@
         <w:rPr>
           <w:rStyle w:val="NormalTok"/>
         </w:rPr>
-        <w:t xml:space="preserve">           </w:t>
+        <w:t xml:space="preserve">                 </w:t>
       </w:r>
       <w:r>
         <w:rPr>
@@ -9798,6 +9798,24 @@
         </w:rPr>
         <w:t xml:space="preserve">)</w:t>
       </w:r>
+      <w:r>
+        <w:br/>
+      </w:r>
+      <w:r>
+        <w:br/>
+      </w:r>
+      <w:r>
+        <w:rPr>
+          <w:rStyle w:val="FunctionTok"/>
+        </w:rPr>
+        <w:t xml:space="preserve">model_parameters</w:t>
+      </w:r>
+      <w:r>
+        <w:rPr>
+          <w:rStyle w:val="NormalTok"/>
+        </w:rPr>
+        <w:t xml:space="preserve">(fit2) </w:t>
+      </w:r>
     </w:p>
     <w:p>
       <w:pPr>
@@ -9807,16 +9825,52 @@
         <w:rPr>
           <w:rStyle w:val="VerbatimChar"/>
         </w:rPr>
-        <w:t xml:space="preserve">Warning: In lm.fit(x, y, offset = offset, singular.ok = singular.ok, ...) :</w:t>
-      </w:r>
-      <w:r>
-        <w:br/>
-      </w:r>
-      <w:r>
-        <w:rPr>
-          <w:rStyle w:val="VerbatimChar"/>
-        </w:rPr>
-        <w:t xml:space="preserve"> extra argument 'refresh' will be disregarded</w:t>
+        <w:t xml:space="preserve">Parameter   | Median |         95% CI |   pd |  Rhat |  ESS |                 Prior</w:t>
+      </w:r>
+      <w:r>
+        <w:br/>
+      </w:r>
+      <w:r>
+        <w:rPr>
+          <w:rStyle w:val="VerbatimChar"/>
+        </w:rPr>
+        <w:t xml:space="preserve">-----------------------------------------------------------------------------------</w:t>
+      </w:r>
+      <w:r>
+        <w:br/>
+      </w:r>
+      <w:r>
+        <w:rPr>
+          <w:rStyle w:val="VerbatimChar"/>
+        </w:rPr>
+        <w:t xml:space="preserve">(Intercept) |  -0.51 | [-0.64, -0.39] | 100% | 1.001 | 1932 | Normal (0.09 +- 1.33)</w:t>
+      </w:r>
+      <w:r>
+        <w:br/>
+      </w:r>
+      <w:r>
+        <w:rPr>
+          <w:rStyle w:val="VerbatimChar"/>
+        </w:rPr>
+        <w:t xml:space="preserve">hfactorLow  |   0.41 | [ 0.23,  0.59] | 100% | 1.001 | 2470 | Normal (0.00 +- 3.06)</w:t>
+      </w:r>
+      <w:r>
+        <w:br/>
+      </w:r>
+      <w:r>
+        <w:rPr>
+          <w:rStyle w:val="VerbatimChar"/>
+        </w:rPr>
+        <w:t xml:space="preserve">hfactorHigh |   0.81 | [ 0.63,  0.98] | 100% | 1.002 | 2288 | Normal (0.00 +- 3.06)</w:t>
+      </w:r>
+      <w:r>
+        <w:br/>
+      </w:r>
+      <w:r>
+        <w:rPr>
+          <w:rStyle w:val="VerbatimChar"/>
+        </w:rPr>
+        <w:t xml:space="preserve">hfactorBest |   1.19 | [ 1.02,  1.37] | 100% | 1.001 | 2583 | Normal (0.00 +- 3.06)</w:t>
       </w:r>
     </w:p>
     <w:p>
@@ -9824,95 +9878,22 @@
         <w:pStyle w:val="SourceCode"/>
       </w:pPr>
       <w:r>
-        <w:rPr>
-          <w:rStyle w:val="FunctionTok"/>
-        </w:rPr>
-        <w:t xml:space="preserve">model_parameters</w:t>
-      </w:r>
-      <w:r>
-        <w:rPr>
-          <w:rStyle w:val="NormalTok"/>
-        </w:rPr>
-        <w:t xml:space="preserve">(fit2) </w:t>
-      </w:r>
-    </w:p>
-    <w:p>
-      <w:pPr>
-        <w:pStyle w:val="SourceCode"/>
-      </w:pPr>
-      <w:r>
-        <w:rPr>
-          <w:rStyle w:val="VerbatimChar"/>
-        </w:rPr>
-        <w:t xml:space="preserve">Parameter      | Coefficient |   SE |         95% CI | t(84) |      p</w:t>
-      </w:r>
-      <w:r>
-        <w:br/>
-      </w:r>
-      <w:r>
-        <w:rPr>
-          <w:rStyle w:val="VerbatimChar"/>
-        </w:rPr>
-        <w:t xml:space="preserve">---------------------------------------------------------------------</w:t>
-      </w:r>
-      <w:r>
-        <w:br/>
-      </w:r>
-      <w:r>
-        <w:rPr>
-          <w:rStyle w:val="VerbatimChar"/>
-        </w:rPr>
-        <w:t xml:space="preserve">(Intercept)    |       -0.51 | 0.06 | [-0.64, -0.39] | -8.17 | &lt; .001</w:t>
-      </w:r>
-      <w:r>
-        <w:br/>
-      </w:r>
-      <w:r>
-        <w:rPr>
-          <w:rStyle w:val="VerbatimChar"/>
-        </w:rPr>
-        <w:t xml:space="preserve">hfactor [Low]  |        0.41 | 0.09 | [ 0.24,  0.59] |  4.65 | &lt; .001</w:t>
-      </w:r>
-      <w:r>
-        <w:br/>
-      </w:r>
-      <w:r>
-        <w:rPr>
-          <w:rStyle w:val="VerbatimChar"/>
-        </w:rPr>
-        <w:t xml:space="preserve">hfactor [High] |        0.81 | 0.09 | [ 0.63,  0.99] |  9.12 | &lt; .001</w:t>
-      </w:r>
-      <w:r>
-        <w:br/>
-      </w:r>
-      <w:r>
-        <w:rPr>
-          <w:rStyle w:val="VerbatimChar"/>
-        </w:rPr>
-        <w:t xml:space="preserve">hfactor [Best] |        1.20 | 0.09 | [ 1.02,  1.37] | 13.47 | &lt; .001</w:t>
-      </w:r>
-    </w:p>
-    <w:p>
-      <w:pPr>
-        <w:pStyle w:val="SourceCode"/>
-      </w:pPr>
-      <w:r>
-        <w:br/>
-      </w:r>
-      <w:r>
-        <w:rPr>
-          <w:rStyle w:val="VerbatimChar"/>
-        </w:rPr>
-        <w:t xml:space="preserve">Uncertainty intervals (equal-tailed) and p-values (two-tailed) computed</w:t>
-      </w:r>
-      <w:r>
-        <w:br/>
-      </w:r>
-      <w:r>
-        <w:rPr>
-          <w:rStyle w:val="VerbatimChar"/>
-        </w:rPr>
-        <w:t xml:space="preserve">  using a Wald t-distribution approximation.</w:t>
+        <w:br/>
+      </w:r>
+      <w:r>
+        <w:rPr>
+          <w:rStyle w:val="VerbatimChar"/>
+        </w:rPr>
+        <w:t xml:space="preserve">Uncertainty intervals (equal-tailed) computed using a MCMC distribution</w:t>
+      </w:r>
+      <w:r>
+        <w:br/>
+      </w:r>
+      <w:r>
+        <w:rPr>
+          <w:rStyle w:val="VerbatimChar"/>
+        </w:rPr>
+        <w:t xml:space="preserve">  approximation.</w:t>
       </w:r>
     </w:p>
     <w:bookmarkEnd w:id="84"/>
@@ -10030,70 +10011,70 @@
         <w:rPr>
           <w:rStyle w:val="VerbatimChar"/>
         </w:rPr>
-        <w:t xml:space="preserve">Level1 | Level2 | Difference |   SE |       99% CI | t(84) |      p</w:t>
-      </w:r>
-      <w:r>
-        <w:br/>
-      </w:r>
-      <w:r>
-        <w:rPr>
-          <w:rStyle w:val="VerbatimChar"/>
-        </w:rPr>
-        <w:t xml:space="preserve">-------------------------------------------------------------------</w:t>
-      </w:r>
-      <w:r>
-        <w:br/>
-      </w:r>
-      <w:r>
-        <w:rPr>
-          <w:rStyle w:val="VerbatimChar"/>
-        </w:rPr>
-        <w:t xml:space="preserve">Low    | Worst  |       0.41 | 0.09 | [0.18, 0.65] |  4.65 | &lt; .001</w:t>
-      </w:r>
-      <w:r>
-        <w:br/>
-      </w:r>
-      <w:r>
-        <w:rPr>
-          <w:rStyle w:val="VerbatimChar"/>
-        </w:rPr>
-        <w:t xml:space="preserve">High   | Worst  |       0.81 | 0.09 | [0.58, 1.04] |  9.12 | &lt; .001</w:t>
-      </w:r>
-      <w:r>
-        <w:br/>
-      </w:r>
-      <w:r>
-        <w:rPr>
-          <w:rStyle w:val="VerbatimChar"/>
-        </w:rPr>
-        <w:t xml:space="preserve">Best   | Worst  |       1.20 | 0.09 | [0.96, 1.43] | 13.47 | &lt; .001</w:t>
-      </w:r>
-      <w:r>
-        <w:br/>
-      </w:r>
-      <w:r>
-        <w:rPr>
-          <w:rStyle w:val="VerbatimChar"/>
-        </w:rPr>
-        <w:t xml:space="preserve">High   | Low    |       0.40 | 0.09 | [0.16, 0.63] |  4.46 | &lt; .001</w:t>
-      </w:r>
-      <w:r>
-        <w:br/>
-      </w:r>
-      <w:r>
-        <w:rPr>
-          <w:rStyle w:val="VerbatimChar"/>
-        </w:rPr>
-        <w:t xml:space="preserve">Best   | Low    |       0.78 | 0.09 | [0.55, 1.02] |  8.81 | &lt; .001</w:t>
-      </w:r>
-      <w:r>
-        <w:br/>
-      </w:r>
-      <w:r>
-        <w:rPr>
-          <w:rStyle w:val="VerbatimChar"/>
-        </w:rPr>
-        <w:t xml:space="preserve">Best   | High   |       0.39 | 0.09 | [0.15, 0.62] |  4.35 | &lt; .001</w:t>
+        <w:t xml:space="preserve">Level1 | Level2 | Median |       99% CI |   pd |          ROPE | % in ROPE</w:t>
+      </w:r>
+      <w:r>
+        <w:br/>
+      </w:r>
+      <w:r>
+        <w:rPr>
+          <w:rStyle w:val="VerbatimChar"/>
+        </w:rPr>
+        <w:t xml:space="preserve">--------------------------------------------------------------------------</w:t>
+      </w:r>
+      <w:r>
+        <w:br/>
+      </w:r>
+      <w:r>
+        <w:rPr>
+          <w:rStyle w:val="VerbatimChar"/>
+        </w:rPr>
+        <w:t xml:space="preserve">Low    | Worst  |   0.41 | [0.19, 0.64] | 100% | [-0.10, 0.10] |        0%</w:t>
+      </w:r>
+      <w:r>
+        <w:br/>
+      </w:r>
+      <w:r>
+        <w:rPr>
+          <w:rStyle w:val="VerbatimChar"/>
+        </w:rPr>
+        <w:t xml:space="preserve">High   | Worst  |   0.81 | [0.59, 1.04] | 100% | [-0.10, 0.10] |        0%</w:t>
+      </w:r>
+      <w:r>
+        <w:br/>
+      </w:r>
+      <w:r>
+        <w:rPr>
+          <w:rStyle w:val="VerbatimChar"/>
+        </w:rPr>
+        <w:t xml:space="preserve">Best   | Worst  |   1.19 | [0.98, 1.45] | 100% | [-0.10, 0.10] |        0%</w:t>
+      </w:r>
+      <w:r>
+        <w:br/>
+      </w:r>
+      <w:r>
+        <w:rPr>
+          <w:rStyle w:val="VerbatimChar"/>
+        </w:rPr>
+        <w:t xml:space="preserve">High   | Low    |   0.40 | [0.16, 0.63] | 100% | [-0.10, 0.10] |        0%</w:t>
+      </w:r>
+      <w:r>
+        <w:br/>
+      </w:r>
+      <w:r>
+        <w:rPr>
+          <w:rStyle w:val="VerbatimChar"/>
+        </w:rPr>
+        <w:t xml:space="preserve">Best   | Low    |   0.78 | [0.54, 1.02] | 100% | [-0.10, 0.10] |        0%</w:t>
+      </w:r>
+      <w:r>
+        <w:br/>
+      </w:r>
+      <w:r>
+        <w:rPr>
+          <w:rStyle w:val="VerbatimChar"/>
+        </w:rPr>
+        <w:t xml:space="preserve">Best   | High   |   0.38 | [0.14, 0.62] | 100% | [-0.10, 0.10] |        0%</w:t>
       </w:r>
       <w:r>
         <w:br/>
@@ -10115,15 +10096,6 @@
           <w:rStyle w:val="VerbatimChar"/>
         </w:rPr>
         <w:t xml:space="preserve">Predictors contrasted: hfactor</w:t>
-      </w:r>
-      <w:r>
-        <w:br/>
-      </w:r>
-      <w:r>
-        <w:rPr>
-          <w:rStyle w:val="VerbatimChar"/>
-        </w:rPr>
-        <w:t xml:space="preserve">p-value adjustment method: Holm (1979)</w:t>
       </w:r>
     </w:p>
     <w:bookmarkEnd w:id="85"/>
@@ -10478,7 +10450,28 @@
         <w:rPr>
           <w:rStyle w:val="NormalTok"/>
         </w:rPr>
-        <w:t xml:space="preserve">, Level2))</w:t>
+        <w:t xml:space="preserve">, Level2),</w:t>
+      </w:r>
+      <w:r>
+        <w:br/>
+      </w:r>
+      <w:r>
+        <w:rPr>
+          <w:rStyle w:val="NormalTok"/>
+        </w:rPr>
+        <w:t xml:space="preserve">           </w:t>
+      </w:r>
+      <w:r>
+        <w:rPr>
+          <w:rStyle w:val="AttributeTok"/>
+        </w:rPr>
+        <w:t xml:space="preserve">Difference =</w:t>
+      </w:r>
+      <w:r>
+        <w:rPr>
+          <w:rStyle w:val="NormalTok"/>
+        </w:rPr>
+        <w:t xml:space="preserve"> Median)</w:t>
       </w:r>
     </w:p>
     <w:p>
@@ -12577,619 +12570,619 @@
         <w:rPr>
           <w:rStyle w:val="VerbatimChar"/>
         </w:rPr>
-        <w:t xml:space="preserve">  colourpicker_1.3.0     commonmark_2.0.0       compiler_4.5.1        </w:t>
-      </w:r>
-      <w:r>
-        <w:br/>
-      </w:r>
-      <w:r>
-        <w:rPr>
-          <w:rStyle w:val="VerbatimChar"/>
-        </w:rPr>
-        <w:t xml:space="preserve">  conflicted_1.2.0       correlation_0.8.8      cowplot_1.2.0         </w:t>
-      </w:r>
-      <w:r>
-        <w:br/>
-      </w:r>
-      <w:r>
-        <w:rPr>
-          <w:rStyle w:val="VerbatimChar"/>
-        </w:rPr>
-        <w:t xml:space="preserve">  cpp11_0.5.2            crayon_1.5.3           crosstalk_1.2.2       </w:t>
-      </w:r>
-      <w:r>
-        <w:br/>
-      </w:r>
-      <w:r>
-        <w:rPr>
-          <w:rStyle w:val="VerbatimChar"/>
-        </w:rPr>
-        <w:t xml:space="preserve">  curl_7.0.0             data.table_1.17.8      datasets_4.5.1        </w:t>
-      </w:r>
-      <w:r>
-        <w:br/>
-      </w:r>
-      <w:r>
-        <w:rPr>
-          <w:rStyle w:val="VerbatimChar"/>
-        </w:rPr>
-        <w:t xml:space="preserve">  datawizard_1.2.0       DBI_1.2.3              dbplyr_2.5.1          </w:t>
-      </w:r>
-      <w:r>
-        <w:br/>
-      </w:r>
-      <w:r>
-        <w:rPr>
-          <w:rStyle w:val="VerbatimChar"/>
-        </w:rPr>
-        <w:t xml:space="preserve">  Deriv_4.2.0            desc_1.4.3             digest_0.6.37         </w:t>
-      </w:r>
-      <w:r>
-        <w:br/>
-      </w:r>
-      <w:r>
-        <w:rPr>
-          <w:rStyle w:val="VerbatimChar"/>
-        </w:rPr>
-        <w:t xml:space="preserve">  distributional_0.5.0   doBy_4.7.0             dplyr_1.1.4           </w:t>
-      </w:r>
-      <w:r>
-        <w:br/>
-      </w:r>
-      <w:r>
-        <w:rPr>
-          <w:rStyle w:val="VerbatimChar"/>
-        </w:rPr>
-        <w:t xml:space="preserve">  DT_0.34.0              dtplyr_1.3.2           dygraphs_1.1.1.6      </w:t>
-      </w:r>
-      <w:r>
-        <w:br/>
-      </w:r>
-      <w:r>
-        <w:rPr>
-          <w:rStyle w:val="VerbatimChar"/>
-        </w:rPr>
-        <w:t xml:space="preserve">  easystats_0.7.5        effectsize_1.0.1       emmeans_1.11.2-8      </w:t>
-      </w:r>
-      <w:r>
-        <w:br/>
-      </w:r>
-      <w:r>
-        <w:rPr>
-          <w:rStyle w:val="VerbatimChar"/>
-        </w:rPr>
-        <w:t xml:space="preserve">  estimability_1.5.1     evaluate_1.0.5         exactRankTests_0.8-35 </w:t>
-      </w:r>
-      <w:r>
-        <w:br/>
-      </w:r>
-      <w:r>
-        <w:rPr>
-          <w:rStyle w:val="VerbatimChar"/>
-        </w:rPr>
-        <w:t xml:space="preserve">  farver_2.1.2           fastmap_1.2.0          fontawesome_0.5.3     </w:t>
-      </w:r>
-      <w:r>
-        <w:br/>
-      </w:r>
-      <w:r>
-        <w:rPr>
-          <w:rStyle w:val="VerbatimChar"/>
-        </w:rPr>
-        <w:t xml:space="preserve">  forcats_1.0.0          foreach_1.5.2          Formula_1.2-5         </w:t>
-      </w:r>
-      <w:r>
-        <w:br/>
-      </w:r>
-      <w:r>
-        <w:rPr>
-          <w:rStyle w:val="VerbatimChar"/>
-        </w:rPr>
-        <w:t xml:space="preserve">  fs_1.6.6               gargle_1.6.0           generics_0.1.4        </w:t>
-      </w:r>
-      <w:r>
-        <w:br/>
-      </w:r>
-      <w:r>
-        <w:rPr>
-          <w:rStyle w:val="VerbatimChar"/>
-        </w:rPr>
-        <w:t xml:space="preserve">  ggplot2_4.0.0          ggrepel_0.9.6          ggridges_0.5.7        </w:t>
-      </w:r>
-      <w:r>
-        <w:br/>
-      </w:r>
-      <w:r>
-        <w:rPr>
-          <w:rStyle w:val="VerbatimChar"/>
-        </w:rPr>
-        <w:t xml:space="preserve">  glmnet_4.1-10          glue_1.8.0             gmp_0.7-5             </w:t>
-      </w:r>
-      <w:r>
-        <w:br/>
-      </w:r>
-      <w:r>
-        <w:rPr>
-          <w:rStyle w:val="VerbatimChar"/>
-        </w:rPr>
-        <w:t xml:space="preserve">  googledrive_2.1.2      googlesheets4_1.1.2    graphics_4.5.1        </w:t>
-      </w:r>
-      <w:r>
-        <w:br/>
-      </w:r>
-      <w:r>
-        <w:rPr>
-          <w:rStyle w:val="VerbatimChar"/>
-        </w:rPr>
-        <w:t xml:space="preserve">  grDevices_4.5.1        grid_4.5.1             gridExtra_2.3         </w:t>
-      </w:r>
-      <w:r>
-        <w:br/>
-      </w:r>
-      <w:r>
-        <w:rPr>
-          <w:rStyle w:val="VerbatimChar"/>
-        </w:rPr>
-        <w:t xml:space="preserve">  gtable_0.3.6           gtools_3.9.5           haven_2.5.5           </w:t>
-      </w:r>
-      <w:r>
-        <w:br/>
-      </w:r>
-      <w:r>
-        <w:rPr>
-          <w:rStyle w:val="VerbatimChar"/>
-        </w:rPr>
-        <w:t xml:space="preserve">  highr_0.11             hms_1.1.3              htmltools_0.5.8.1     </w:t>
-      </w:r>
-      <w:r>
-        <w:br/>
-      </w:r>
-      <w:r>
-        <w:rPr>
-          <w:rStyle w:val="VerbatimChar"/>
-        </w:rPr>
-        <w:t xml:space="preserve">  htmlwidgets_1.6.4      httpuv_1.6.16          httr_1.4.7            </w:t>
-      </w:r>
-      <w:r>
-        <w:br/>
-      </w:r>
-      <w:r>
-        <w:rPr>
-          <w:rStyle w:val="VerbatimChar"/>
-        </w:rPr>
-        <w:t xml:space="preserve">  ids_1.0.1              igraph_2.1.4           inline_0.3.21         </w:t>
-      </w:r>
-      <w:r>
-        <w:br/>
-      </w:r>
-      <w:r>
-        <w:rPr>
-          <w:rStyle w:val="VerbatimChar"/>
-        </w:rPr>
-        <w:t xml:space="preserve">  insight_1.4.2          isoband_0.2.7          iterators_1.0.14      </w:t>
-      </w:r>
-      <w:r>
-        <w:br/>
-      </w:r>
-      <w:r>
-        <w:rPr>
-          <w:rStyle w:val="VerbatimChar"/>
-        </w:rPr>
-        <w:t xml:space="preserve">  janitor_2.2.1          jomo_2.7-6             jquerylib_0.1.4       </w:t>
-      </w:r>
-      <w:r>
-        <w:br/>
-      </w:r>
-      <w:r>
-        <w:rPr>
-          <w:rStyle w:val="VerbatimChar"/>
-        </w:rPr>
-        <w:t xml:space="preserve">  jsonlite_2.0.0         knitr_1.50             labeling_0.4.3        </w:t>
-      </w:r>
-      <w:r>
-        <w:br/>
-      </w:r>
-      <w:r>
-        <w:rPr>
-          <w:rStyle w:val="VerbatimChar"/>
-        </w:rPr>
-        <w:t xml:space="preserve">  later_1.4.4            lattice_0.22-7         lazyeval_0.2.2        </w:t>
-      </w:r>
-      <w:r>
-        <w:br/>
-      </w:r>
-      <w:r>
-        <w:rPr>
-          <w:rStyle w:val="VerbatimChar"/>
-        </w:rPr>
-        <w:t xml:space="preserve">  lifecycle_1.0.4        litedown_0.7           lme4_1.1-37           </w:t>
-      </w:r>
-      <w:r>
-        <w:br/>
-      </w:r>
-      <w:r>
-        <w:rPr>
-          <w:rStyle w:val="VerbatimChar"/>
-        </w:rPr>
-        <w:t xml:space="preserve">  loo_2.8.0              lubridate_1.9.4        magrittr_2.0.4        </w:t>
-      </w:r>
-      <w:r>
-        <w:br/>
-      </w:r>
-      <w:r>
-        <w:rPr>
-          <w:rStyle w:val="VerbatimChar"/>
-        </w:rPr>
-        <w:t xml:space="preserve">  marginaleffects_0.30.0 markdown_2.0           MASS_7.3-65           </w:t>
-      </w:r>
-      <w:r>
-        <w:br/>
-      </w:r>
-      <w:r>
-        <w:rPr>
-          <w:rStyle w:val="VerbatimChar"/>
-        </w:rPr>
-        <w:t xml:space="preserve">  Matrix_1.7-4           MatrixModels_0.5.4     matrixStats_1.5.0     </w:t>
-      </w:r>
-      <w:r>
-        <w:br/>
-      </w:r>
-      <w:r>
-        <w:rPr>
-          <w:rStyle w:val="VerbatimChar"/>
-        </w:rPr>
-        <w:t xml:space="preserve">  memoise_2.0.1          methods_4.5.1          mgcv_1.9-3            </w:t>
-      </w:r>
-      <w:r>
-        <w:br/>
-      </w:r>
-      <w:r>
-        <w:rPr>
-          <w:rStyle w:val="VerbatimChar"/>
-        </w:rPr>
-        <w:t xml:space="preserve">  mice_3.18.0            miceadds_3.18-36       microbenchmark_1.5.0  </w:t>
-      </w:r>
-      <w:r>
-        <w:br/>
-      </w:r>
-      <w:r>
-        <w:rPr>
-          <w:rStyle w:val="VerbatimChar"/>
-        </w:rPr>
-        <w:t xml:space="preserve">  mime_0.13              miniUI_0.1.2           minqa_1.2.8           </w:t>
-      </w:r>
-      <w:r>
-        <w:br/>
-      </w:r>
-      <w:r>
-        <w:rPr>
-          <w:rStyle w:val="VerbatimChar"/>
-        </w:rPr>
-        <w:t xml:space="preserve">  mitml_0.4-5            mitools_2.4            MKdescr_0.9           </w:t>
-      </w:r>
-      <w:r>
-        <w:br/>
-      </w:r>
-      <w:r>
-        <w:rPr>
-          <w:rStyle w:val="VerbatimChar"/>
-        </w:rPr>
-        <w:t xml:space="preserve">  MKinfer_1.2            modelbased_0.13.0      modelr_0.1.11         </w:t>
-      </w:r>
-      <w:r>
-        <w:br/>
-      </w:r>
-      <w:r>
-        <w:rPr>
-          <w:rStyle w:val="VerbatimChar"/>
-        </w:rPr>
-        <w:t xml:space="preserve">  multcomp_1.4-28        mvtnorm_1.3-3          nlme_3.1-168          </w:t>
-      </w:r>
-      <w:r>
-        <w:br/>
-      </w:r>
-      <w:r>
-        <w:rPr>
-          <w:rStyle w:val="VerbatimChar"/>
-        </w:rPr>
-        <w:t xml:space="preserve">  nloptr_2.2.1           nnet_7.3-20            numDeriv_2016.8.1.1   </w:t>
-      </w:r>
-      <w:r>
-        <w:br/>
-      </w:r>
-      <w:r>
-        <w:rPr>
-          <w:rStyle w:val="VerbatimChar"/>
-        </w:rPr>
-        <w:t xml:space="preserve">  openssl_2.3.3          ordinal_2023.12.4.1    pan_1.9               </w:t>
-      </w:r>
-      <w:r>
-        <w:br/>
-      </w:r>
-      <w:r>
-        <w:rPr>
-          <w:rStyle w:val="VerbatimChar"/>
-        </w:rPr>
-        <w:t xml:space="preserve">  parallel_4.5.1         parameters_0.28.2      patchwork_1.3.2       </w:t>
-      </w:r>
-      <w:r>
-        <w:br/>
-      </w:r>
-      <w:r>
-        <w:rPr>
-          <w:rStyle w:val="VerbatimChar"/>
-        </w:rPr>
-        <w:t xml:space="preserve">  pbkrtest_0.5.5         performance_0.15.1     pillar_1.11.1         </w:t>
-      </w:r>
-      <w:r>
-        <w:br/>
-      </w:r>
-      <w:r>
-        <w:rPr>
-          <w:rStyle w:val="VerbatimChar"/>
-        </w:rPr>
-        <w:t xml:space="preserve">  pkgbuild_1.4.8         pkgconfig_2.0.3        plyr_1.8.9            </w:t>
-      </w:r>
-      <w:r>
-        <w:br/>
-      </w:r>
-      <w:r>
-        <w:rPr>
-          <w:rStyle w:val="VerbatimChar"/>
-        </w:rPr>
-        <w:t xml:space="preserve">  posterior_1.6.1        prettyunits_1.2.0      processx_3.8.6        </w:t>
-      </w:r>
-      <w:r>
-        <w:br/>
-      </w:r>
-      <w:r>
-        <w:rPr>
-          <w:rStyle w:val="VerbatimChar"/>
-        </w:rPr>
-        <w:t xml:space="preserve">  progress_1.2.3         promises_1.3.3         ps_1.9.1              </w:t>
-      </w:r>
-      <w:r>
-        <w:br/>
-      </w:r>
-      <w:r>
-        <w:rPr>
-          <w:rStyle w:val="VerbatimChar"/>
-        </w:rPr>
-        <w:t xml:space="preserve">  purrr_1.1.0            quantreg_6.1           QuickJSR_1.8.1        </w:t>
-      </w:r>
-      <w:r>
-        <w:br/>
-      </w:r>
-      <w:r>
-        <w:rPr>
-          <w:rStyle w:val="VerbatimChar"/>
-        </w:rPr>
-        <w:t xml:space="preserve">  R6_2.6.1               ragg_1.5.0             rappdirs_0.3.3        </w:t>
-      </w:r>
-      <w:r>
-        <w:br/>
-      </w:r>
-      <w:r>
-        <w:rPr>
-          <w:rStyle w:val="VerbatimChar"/>
-        </w:rPr>
-        <w:t xml:space="preserve">  rbibutils_2.3          RColorBrewer_1.1-3     Rcpp_1.1.0            </w:t>
-      </w:r>
-      <w:r>
-        <w:br/>
-      </w:r>
-      <w:r>
-        <w:rPr>
-          <w:rStyle w:val="VerbatimChar"/>
-        </w:rPr>
-        <w:t xml:space="preserve">  RcppArmadillo_15.0.2.2 RcppEigen_0.3.4.0.2    RcppParallel_5.1.11-1 </w:t>
-      </w:r>
-      <w:r>
-        <w:br/>
-      </w:r>
-      <w:r>
-        <w:rPr>
-          <w:rStyle w:val="VerbatimChar"/>
-        </w:rPr>
-        <w:t xml:space="preserve">  Rdpack_2.6.4           readr_2.1.5            readxl_1.4.5          </w:t>
-      </w:r>
-      <w:r>
-        <w:br/>
-      </w:r>
-      <w:r>
-        <w:rPr>
-          <w:rStyle w:val="VerbatimChar"/>
-        </w:rPr>
-        <w:t xml:space="preserve">  reformulas_0.4.1       rematch_2.0.0          rematch2_2.1.2        </w:t>
-      </w:r>
-      <w:r>
-        <w:br/>
-      </w:r>
-      <w:r>
-        <w:rPr>
-          <w:rStyle w:val="VerbatimChar"/>
-        </w:rPr>
-        <w:t xml:space="preserve">  report_0.6.1           reprex_2.1.1           reshape2_1.4.4        </w:t>
-      </w:r>
-      <w:r>
-        <w:br/>
-      </w:r>
-      <w:r>
-        <w:rPr>
-          <w:rStyle w:val="VerbatimChar"/>
-        </w:rPr>
-        <w:t xml:space="preserve">  rlang_1.1.6            rmarkdown_2.29         rpart_4.1.24          </w:t>
-      </w:r>
-      <w:r>
-        <w:br/>
-      </w:r>
-      <w:r>
-        <w:rPr>
-          <w:rStyle w:val="VerbatimChar"/>
-        </w:rPr>
-        <w:t xml:space="preserve">  rstan_2.32.7           rstanarm_2.32.1        rstantools_2.5.0      </w:t>
-      </w:r>
-      <w:r>
-        <w:br/>
-      </w:r>
-      <w:r>
-        <w:rPr>
-          <w:rStyle w:val="VerbatimChar"/>
-        </w:rPr>
-        <w:t xml:space="preserve">  rstudioapi_0.17.1      rvest_1.0.5            S7_0.2.0              </w:t>
-      </w:r>
-      <w:r>
-        <w:br/>
-      </w:r>
-      <w:r>
-        <w:rPr>
-          <w:rStyle w:val="VerbatimChar"/>
-        </w:rPr>
-        <w:t xml:space="preserve">  sandwich_3.1-1         sass_0.4.10            scales_1.4.0          </w:t>
-      </w:r>
-      <w:r>
-        <w:br/>
-      </w:r>
-      <w:r>
-        <w:rPr>
-          <w:rStyle w:val="VerbatimChar"/>
-        </w:rPr>
-        <w:t xml:space="preserve">  see_0.12.0             selectr_0.4.2          shape_1.4.6.1         </w:t>
-      </w:r>
-      <w:r>
-        <w:br/>
-      </w:r>
-      <w:r>
-        <w:rPr>
-          <w:rStyle w:val="VerbatimChar"/>
-        </w:rPr>
-        <w:t xml:space="preserve">  shiny_1.11.1           shinyjs_2.1.0          shinystan_2.6.0       </w:t>
-      </w:r>
-      <w:r>
-        <w:br/>
-      </w:r>
-      <w:r>
-        <w:rPr>
-          <w:rStyle w:val="VerbatimChar"/>
-        </w:rPr>
-        <w:t xml:space="preserve">  shinythemes_1.2.0      snakecase_0.11.1       sourcetools_0.1.7.1   </w:t>
-      </w:r>
-      <w:r>
-        <w:br/>
-      </w:r>
-      <w:r>
-        <w:rPr>
-          <w:rStyle w:val="VerbatimChar"/>
-        </w:rPr>
-        <w:t xml:space="preserve">  SparseM_1.84.2         splines_4.5.1          StanHeaders_2.32.10   </w:t>
-      </w:r>
-      <w:r>
-        <w:br/>
-      </w:r>
-      <w:r>
-        <w:rPr>
-          <w:rStyle w:val="VerbatimChar"/>
-        </w:rPr>
-        <w:t xml:space="preserve">  stats_4.5.1            stats4_4.5.1           stringi_1.8.7         </w:t>
-      </w:r>
-      <w:r>
-        <w:br/>
-      </w:r>
-      <w:r>
-        <w:rPr>
-          <w:rStyle w:val="VerbatimChar"/>
-        </w:rPr>
-        <w:t xml:space="preserve">  stringr_1.5.2          survival_3.8-3         sys_3.4.3             </w:t>
-      </w:r>
-      <w:r>
-        <w:br/>
-      </w:r>
-      <w:r>
-        <w:rPr>
-          <w:rStyle w:val="VerbatimChar"/>
-        </w:rPr>
-        <w:t xml:space="preserve">  systemfonts_1.2.3      tensorA_0.36.2.1       textshaping_1.0.3     </w:t>
-      </w:r>
-      <w:r>
-        <w:br/>
-      </w:r>
-      <w:r>
-        <w:rPr>
-          <w:rStyle w:val="VerbatimChar"/>
-        </w:rPr>
-        <w:t xml:space="preserve">  TH.data_1.1-4          threejs_0.3.4          tibble_3.3.0          </w:t>
-      </w:r>
-      <w:r>
-        <w:br/>
-      </w:r>
-      <w:r>
-        <w:rPr>
-          <w:rStyle w:val="VerbatimChar"/>
-        </w:rPr>
-        <w:t xml:space="preserve">  tidyr_1.3.1            tidyselect_1.2.1       tidyverse_2.0.0       </w:t>
-      </w:r>
-      <w:r>
-        <w:br/>
-      </w:r>
-      <w:r>
-        <w:rPr>
-          <w:rStyle w:val="VerbatimChar"/>
-        </w:rPr>
-        <w:t xml:space="preserve">  timechange_0.3.0       tinytex_0.57           tools_4.5.1           </w:t>
-      </w:r>
-      <w:r>
-        <w:br/>
-      </w:r>
-      <w:r>
-        <w:rPr>
-          <w:rStyle w:val="VerbatimChar"/>
-        </w:rPr>
-        <w:t xml:space="preserve">  tzdb_0.5.0             ucminf_1.2.2           utf8_1.2.6            </w:t>
-      </w:r>
-      <w:r>
-        <w:br/>
-      </w:r>
-      <w:r>
-        <w:rPr>
-          <w:rStyle w:val="VerbatimChar"/>
-        </w:rPr>
-        <w:t xml:space="preserve">  utils_4.5.1            uuid_1.2.1             V8_7.0.0              </w:t>
-      </w:r>
-      <w:r>
-        <w:br/>
-      </w:r>
-      <w:r>
-        <w:rPr>
-          <w:rStyle w:val="VerbatimChar"/>
-        </w:rPr>
-        <w:t xml:space="preserve">  vctrs_0.6.5            viridisLite_0.4.2      vroom_1.6.6           </w:t>
-      </w:r>
-      <w:r>
-        <w:br/>
-      </w:r>
-      <w:r>
-        <w:rPr>
-          <w:rStyle w:val="VerbatimChar"/>
-        </w:rPr>
-        <w:t xml:space="preserve">  withr_3.0.2            xfun_0.53              xml2_1.4.0            </w:t>
-      </w:r>
-      <w:r>
-        <w:br/>
-      </w:r>
-      <w:r>
-        <w:rPr>
-          <w:rStyle w:val="VerbatimChar"/>
-        </w:rPr>
-        <w:t xml:space="preserve">  xtable_1.8-4           xts_0.14.1             yaml_2.3.10           </w:t>
-      </w:r>
-      <w:r>
-        <w:br/>
-      </w:r>
-      <w:r>
-        <w:rPr>
-          <w:rStyle w:val="VerbatimChar"/>
-        </w:rPr>
-        <w:t xml:space="preserve">  zoo_1.8-14            </w:t>
+        <w:t xml:space="preserve">  collapse_2.1.3         colourpicker_1.3.0     commonmark_2.0.0      </w:t>
+      </w:r>
+      <w:r>
+        <w:br/>
+      </w:r>
+      <w:r>
+        <w:rPr>
+          <w:rStyle w:val="VerbatimChar"/>
+        </w:rPr>
+        <w:t xml:space="preserve">  compiler_4.5.1         conflicted_1.2.0       correlation_0.8.8     </w:t>
+      </w:r>
+      <w:r>
+        <w:br/>
+      </w:r>
+      <w:r>
+        <w:rPr>
+          <w:rStyle w:val="VerbatimChar"/>
+        </w:rPr>
+        <w:t xml:space="preserve">  cowplot_1.2.0          cpp11_0.5.2            crayon_1.5.3          </w:t>
+      </w:r>
+      <w:r>
+        <w:br/>
+      </w:r>
+      <w:r>
+        <w:rPr>
+          <w:rStyle w:val="VerbatimChar"/>
+        </w:rPr>
+        <w:t xml:space="preserve">  crosstalk_1.2.2        curl_7.0.0             data.table_1.17.8     </w:t>
+      </w:r>
+      <w:r>
+        <w:br/>
+      </w:r>
+      <w:r>
+        <w:rPr>
+          <w:rStyle w:val="VerbatimChar"/>
+        </w:rPr>
+        <w:t xml:space="preserve">  datasets_4.5.1         datawizard_1.2.0       DBI_1.2.3             </w:t>
+      </w:r>
+      <w:r>
+        <w:br/>
+      </w:r>
+      <w:r>
+        <w:rPr>
+          <w:rStyle w:val="VerbatimChar"/>
+        </w:rPr>
+        <w:t xml:space="preserve">  dbplyr_2.5.1           Deriv_4.2.0            desc_1.4.3            </w:t>
+      </w:r>
+      <w:r>
+        <w:br/>
+      </w:r>
+      <w:r>
+        <w:rPr>
+          <w:rStyle w:val="VerbatimChar"/>
+        </w:rPr>
+        <w:t xml:space="preserve">  digest_0.6.37          distributional_0.5.0   doBy_4.7.0            </w:t>
+      </w:r>
+      <w:r>
+        <w:br/>
+      </w:r>
+      <w:r>
+        <w:rPr>
+          <w:rStyle w:val="VerbatimChar"/>
+        </w:rPr>
+        <w:t xml:space="preserve">  dplyr_1.1.4            DT_0.34.0              dtplyr_1.3.2          </w:t>
+      </w:r>
+      <w:r>
+        <w:br/>
+      </w:r>
+      <w:r>
+        <w:rPr>
+          <w:rStyle w:val="VerbatimChar"/>
+        </w:rPr>
+        <w:t xml:space="preserve">  dygraphs_1.1.1.6       easystats_0.7.5        effectsize_1.0.1      </w:t>
+      </w:r>
+      <w:r>
+        <w:br/>
+      </w:r>
+      <w:r>
+        <w:rPr>
+          <w:rStyle w:val="VerbatimChar"/>
+        </w:rPr>
+        <w:t xml:space="preserve">  emmeans_1.11.2-8       estimability_1.5.1     evaluate_1.0.5        </w:t>
+      </w:r>
+      <w:r>
+        <w:br/>
+      </w:r>
+      <w:r>
+        <w:rPr>
+          <w:rStyle w:val="VerbatimChar"/>
+        </w:rPr>
+        <w:t xml:space="preserve">  exactRankTests_0.8-35  farver_2.1.2           fastmap_1.2.0         </w:t>
+      </w:r>
+      <w:r>
+        <w:br/>
+      </w:r>
+      <w:r>
+        <w:rPr>
+          <w:rStyle w:val="VerbatimChar"/>
+        </w:rPr>
+        <w:t xml:space="preserve">  fontawesome_0.5.3      forcats_1.0.0          foreach_1.5.2         </w:t>
+      </w:r>
+      <w:r>
+        <w:br/>
+      </w:r>
+      <w:r>
+        <w:rPr>
+          <w:rStyle w:val="VerbatimChar"/>
+        </w:rPr>
+        <w:t xml:space="preserve">  Formula_1.2-5          fs_1.6.6               gargle_1.6.0          </w:t>
+      </w:r>
+      <w:r>
+        <w:br/>
+      </w:r>
+      <w:r>
+        <w:rPr>
+          <w:rStyle w:val="VerbatimChar"/>
+        </w:rPr>
+        <w:t xml:space="preserve">  generics_0.1.4         ggplot2_4.0.0          ggrepel_0.9.6         </w:t>
+      </w:r>
+      <w:r>
+        <w:br/>
+      </w:r>
+      <w:r>
+        <w:rPr>
+          <w:rStyle w:val="VerbatimChar"/>
+        </w:rPr>
+        <w:t xml:space="preserve">  ggridges_0.5.7         glmnet_4.1-10          glue_1.8.0            </w:t>
+      </w:r>
+      <w:r>
+        <w:br/>
+      </w:r>
+      <w:r>
+        <w:rPr>
+          <w:rStyle w:val="VerbatimChar"/>
+        </w:rPr>
+        <w:t xml:space="preserve">  gmp_0.7-5              googledrive_2.1.2      googlesheets4_1.1.2   </w:t>
+      </w:r>
+      <w:r>
+        <w:br/>
+      </w:r>
+      <w:r>
+        <w:rPr>
+          <w:rStyle w:val="VerbatimChar"/>
+        </w:rPr>
+        <w:t xml:space="preserve">  graphics_4.5.1         grDevices_4.5.1        grid_4.5.1            </w:t>
+      </w:r>
+      <w:r>
+        <w:br/>
+      </w:r>
+      <w:r>
+        <w:rPr>
+          <w:rStyle w:val="VerbatimChar"/>
+        </w:rPr>
+        <w:t xml:space="preserve">  gridExtra_2.3          gtable_0.3.6           gtools_3.9.5          </w:t>
+      </w:r>
+      <w:r>
+        <w:br/>
+      </w:r>
+      <w:r>
+        <w:rPr>
+          <w:rStyle w:val="VerbatimChar"/>
+        </w:rPr>
+        <w:t xml:space="preserve">  haven_2.5.5            highr_0.11             hms_1.1.3             </w:t>
+      </w:r>
+      <w:r>
+        <w:br/>
+      </w:r>
+      <w:r>
+        <w:rPr>
+          <w:rStyle w:val="VerbatimChar"/>
+        </w:rPr>
+        <w:t xml:space="preserve">  htmltools_0.5.8.1      htmlwidgets_1.6.4      httpuv_1.6.16         </w:t>
+      </w:r>
+      <w:r>
+        <w:br/>
+      </w:r>
+      <w:r>
+        <w:rPr>
+          <w:rStyle w:val="VerbatimChar"/>
+        </w:rPr>
+        <w:t xml:space="preserve">  httr_1.4.7             ids_1.0.1              igraph_2.1.4          </w:t>
+      </w:r>
+      <w:r>
+        <w:br/>
+      </w:r>
+      <w:r>
+        <w:rPr>
+          <w:rStyle w:val="VerbatimChar"/>
+        </w:rPr>
+        <w:t xml:space="preserve">  inline_0.3.21          insight_1.4.2          isoband_0.2.7         </w:t>
+      </w:r>
+      <w:r>
+        <w:br/>
+      </w:r>
+      <w:r>
+        <w:rPr>
+          <w:rStyle w:val="VerbatimChar"/>
+        </w:rPr>
+        <w:t xml:space="preserve">  iterators_1.0.14       janitor_2.2.1          jomo_2.7-6            </w:t>
+      </w:r>
+      <w:r>
+        <w:br/>
+      </w:r>
+      <w:r>
+        <w:rPr>
+          <w:rStyle w:val="VerbatimChar"/>
+        </w:rPr>
+        <w:t xml:space="preserve">  jquerylib_0.1.4        jsonlite_2.0.0         knitr_1.50            </w:t>
+      </w:r>
+      <w:r>
+        <w:br/>
+      </w:r>
+      <w:r>
+        <w:rPr>
+          <w:rStyle w:val="VerbatimChar"/>
+        </w:rPr>
+        <w:t xml:space="preserve">  labeling_0.4.3         later_1.4.4            lattice_0.22-7        </w:t>
+      </w:r>
+      <w:r>
+        <w:br/>
+      </w:r>
+      <w:r>
+        <w:rPr>
+          <w:rStyle w:val="VerbatimChar"/>
+        </w:rPr>
+        <w:t xml:space="preserve">  lazyeval_0.2.2         lifecycle_1.0.4        litedown_0.7          </w:t>
+      </w:r>
+      <w:r>
+        <w:br/>
+      </w:r>
+      <w:r>
+        <w:rPr>
+          <w:rStyle w:val="VerbatimChar"/>
+        </w:rPr>
+        <w:t xml:space="preserve">  lme4_1.1-37            loo_2.8.0              lubridate_1.9.4       </w:t>
+      </w:r>
+      <w:r>
+        <w:br/>
+      </w:r>
+      <w:r>
+        <w:rPr>
+          <w:rStyle w:val="VerbatimChar"/>
+        </w:rPr>
+        <w:t xml:space="preserve">  magrittr_2.0.4         marginaleffects_0.30.0 markdown_2.0          </w:t>
+      </w:r>
+      <w:r>
+        <w:br/>
+      </w:r>
+      <w:r>
+        <w:rPr>
+          <w:rStyle w:val="VerbatimChar"/>
+        </w:rPr>
+        <w:t xml:space="preserve">  MASS_7.3-65            Matrix_1.7-4           MatrixModels_0.5.4    </w:t>
+      </w:r>
+      <w:r>
+        <w:br/>
+      </w:r>
+      <w:r>
+        <w:rPr>
+          <w:rStyle w:val="VerbatimChar"/>
+        </w:rPr>
+        <w:t xml:space="preserve">  matrixStats_1.5.0      memoise_2.0.1          methods_4.5.1         </w:t>
+      </w:r>
+      <w:r>
+        <w:br/>
+      </w:r>
+      <w:r>
+        <w:rPr>
+          <w:rStyle w:val="VerbatimChar"/>
+        </w:rPr>
+        <w:t xml:space="preserve">  mgcv_1.9-3             mice_3.18.0            miceadds_3.18-36      </w:t>
+      </w:r>
+      <w:r>
+        <w:br/>
+      </w:r>
+      <w:r>
+        <w:rPr>
+          <w:rStyle w:val="VerbatimChar"/>
+        </w:rPr>
+        <w:t xml:space="preserve">  microbenchmark_1.5.0   mime_0.13              miniUI_0.1.2          </w:t>
+      </w:r>
+      <w:r>
+        <w:br/>
+      </w:r>
+      <w:r>
+        <w:rPr>
+          <w:rStyle w:val="VerbatimChar"/>
+        </w:rPr>
+        <w:t xml:space="preserve">  minqa_1.2.8            mitml_0.4-5            mitools_2.4           </w:t>
+      </w:r>
+      <w:r>
+        <w:br/>
+      </w:r>
+      <w:r>
+        <w:rPr>
+          <w:rStyle w:val="VerbatimChar"/>
+        </w:rPr>
+        <w:t xml:space="preserve">  MKdescr_0.9            MKinfer_1.2            modelbased_0.13.0     </w:t>
+      </w:r>
+      <w:r>
+        <w:br/>
+      </w:r>
+      <w:r>
+        <w:rPr>
+          <w:rStyle w:val="VerbatimChar"/>
+        </w:rPr>
+        <w:t xml:space="preserve">  modelr_0.1.11          multcomp_1.4-28        mvtnorm_1.3-3         </w:t>
+      </w:r>
+      <w:r>
+        <w:br/>
+      </w:r>
+      <w:r>
+        <w:rPr>
+          <w:rStyle w:val="VerbatimChar"/>
+        </w:rPr>
+        <w:t xml:space="preserve">  nlme_3.1-168           nloptr_2.2.1           nnet_7.3-20           </w:t>
+      </w:r>
+      <w:r>
+        <w:br/>
+      </w:r>
+      <w:r>
+        <w:rPr>
+          <w:rStyle w:val="VerbatimChar"/>
+        </w:rPr>
+        <w:t xml:space="preserve">  numDeriv_2016.8.1.1    openssl_2.3.3          ordinal_2023.12.4.1   </w:t>
+      </w:r>
+      <w:r>
+        <w:br/>
+      </w:r>
+      <w:r>
+        <w:rPr>
+          <w:rStyle w:val="VerbatimChar"/>
+        </w:rPr>
+        <w:t xml:space="preserve">  pan_1.9                parallel_4.5.1         parameters_0.28.2     </w:t>
+      </w:r>
+      <w:r>
+        <w:br/>
+      </w:r>
+      <w:r>
+        <w:rPr>
+          <w:rStyle w:val="VerbatimChar"/>
+        </w:rPr>
+        <w:t xml:space="preserve">  patchwork_1.3.2        pbkrtest_0.5.5         performance_0.15.1    </w:t>
+      </w:r>
+      <w:r>
+        <w:br/>
+      </w:r>
+      <w:r>
+        <w:rPr>
+          <w:rStyle w:val="VerbatimChar"/>
+        </w:rPr>
+        <w:t xml:space="preserve">  pillar_1.11.1          pkgbuild_1.4.8         pkgconfig_2.0.3       </w:t>
+      </w:r>
+      <w:r>
+        <w:br/>
+      </w:r>
+      <w:r>
+        <w:rPr>
+          <w:rStyle w:val="VerbatimChar"/>
+        </w:rPr>
+        <w:t xml:space="preserve">  plyr_1.8.9             posterior_1.6.1        prettyunits_1.2.0     </w:t>
+      </w:r>
+      <w:r>
+        <w:br/>
+      </w:r>
+      <w:r>
+        <w:rPr>
+          <w:rStyle w:val="VerbatimChar"/>
+        </w:rPr>
+        <w:t xml:space="preserve">  processx_3.8.6         progress_1.2.3         promises_1.3.3        </w:t>
+      </w:r>
+      <w:r>
+        <w:br/>
+      </w:r>
+      <w:r>
+        <w:rPr>
+          <w:rStyle w:val="VerbatimChar"/>
+        </w:rPr>
+        <w:t xml:space="preserve">  ps_1.9.1               purrr_1.1.0            quantreg_6.1          </w:t>
+      </w:r>
+      <w:r>
+        <w:br/>
+      </w:r>
+      <w:r>
+        <w:rPr>
+          <w:rStyle w:val="VerbatimChar"/>
+        </w:rPr>
+        <w:t xml:space="preserve">  QuickJSR_1.8.1         R6_2.6.1               ragg_1.5.0            </w:t>
+      </w:r>
+      <w:r>
+        <w:br/>
+      </w:r>
+      <w:r>
+        <w:rPr>
+          <w:rStyle w:val="VerbatimChar"/>
+        </w:rPr>
+        <w:t xml:space="preserve">  rappdirs_0.3.3         rbibutils_2.3          RColorBrewer_1.1-3    </w:t>
+      </w:r>
+      <w:r>
+        <w:br/>
+      </w:r>
+      <w:r>
+        <w:rPr>
+          <w:rStyle w:val="VerbatimChar"/>
+        </w:rPr>
+        <w:t xml:space="preserve">  Rcpp_1.1.0             RcppArmadillo_15.0.2.2 RcppEigen_0.3.4.0.2   </w:t>
+      </w:r>
+      <w:r>
+        <w:br/>
+      </w:r>
+      <w:r>
+        <w:rPr>
+          <w:rStyle w:val="VerbatimChar"/>
+        </w:rPr>
+        <w:t xml:space="preserve">  RcppParallel_5.1.11-1  Rdpack_2.6.4           readr_2.1.5           </w:t>
+      </w:r>
+      <w:r>
+        <w:br/>
+      </w:r>
+      <w:r>
+        <w:rPr>
+          <w:rStyle w:val="VerbatimChar"/>
+        </w:rPr>
+        <w:t xml:space="preserve">  readxl_1.4.5           reformulas_0.4.1       rematch_2.0.0         </w:t>
+      </w:r>
+      <w:r>
+        <w:br/>
+      </w:r>
+      <w:r>
+        <w:rPr>
+          <w:rStyle w:val="VerbatimChar"/>
+        </w:rPr>
+        <w:t xml:space="preserve">  rematch2_2.1.2         report_0.6.1           reprex_2.1.1          </w:t>
+      </w:r>
+      <w:r>
+        <w:br/>
+      </w:r>
+      <w:r>
+        <w:rPr>
+          <w:rStyle w:val="VerbatimChar"/>
+        </w:rPr>
+        <w:t xml:space="preserve">  reshape2_1.4.4         rlang_1.1.6            rmarkdown_2.29        </w:t>
+      </w:r>
+      <w:r>
+        <w:br/>
+      </w:r>
+      <w:r>
+        <w:rPr>
+          <w:rStyle w:val="VerbatimChar"/>
+        </w:rPr>
+        <w:t xml:space="preserve">  rpart_4.1.24           rstan_2.32.7           rstanarm_2.32.1       </w:t>
+      </w:r>
+      <w:r>
+        <w:br/>
+      </w:r>
+      <w:r>
+        <w:rPr>
+          <w:rStyle w:val="VerbatimChar"/>
+        </w:rPr>
+        <w:t xml:space="preserve">  rstantools_2.5.0       rstudioapi_0.17.1      rvest_1.0.5           </w:t>
+      </w:r>
+      <w:r>
+        <w:br/>
+      </w:r>
+      <w:r>
+        <w:rPr>
+          <w:rStyle w:val="VerbatimChar"/>
+        </w:rPr>
+        <w:t xml:space="preserve">  S7_0.2.0               sandwich_3.1-1         sass_0.4.10           </w:t>
+      </w:r>
+      <w:r>
+        <w:br/>
+      </w:r>
+      <w:r>
+        <w:rPr>
+          <w:rStyle w:val="VerbatimChar"/>
+        </w:rPr>
+        <w:t xml:space="preserve">  scales_1.4.0           see_0.12.0             selectr_0.4.2         </w:t>
+      </w:r>
+      <w:r>
+        <w:br/>
+      </w:r>
+      <w:r>
+        <w:rPr>
+          <w:rStyle w:val="VerbatimChar"/>
+        </w:rPr>
+        <w:t xml:space="preserve">  shape_1.4.6.1          shiny_1.11.1           shinyjs_2.1.0         </w:t>
+      </w:r>
+      <w:r>
+        <w:br/>
+      </w:r>
+      <w:r>
+        <w:rPr>
+          <w:rStyle w:val="VerbatimChar"/>
+        </w:rPr>
+        <w:t xml:space="preserve">  shinystan_2.6.0        shinythemes_1.2.0      snakecase_0.11.1      </w:t>
+      </w:r>
+      <w:r>
+        <w:br/>
+      </w:r>
+      <w:r>
+        <w:rPr>
+          <w:rStyle w:val="VerbatimChar"/>
+        </w:rPr>
+        <w:t xml:space="preserve">  sourcetools_0.1.7.1    SparseM_1.84.2         splines_4.5.1         </w:t>
+      </w:r>
+      <w:r>
+        <w:br/>
+      </w:r>
+      <w:r>
+        <w:rPr>
+          <w:rStyle w:val="VerbatimChar"/>
+        </w:rPr>
+        <w:t xml:space="preserve">  StanHeaders_2.32.10    stats_4.5.1            stats4_4.5.1          </w:t>
+      </w:r>
+      <w:r>
+        <w:br/>
+      </w:r>
+      <w:r>
+        <w:rPr>
+          <w:rStyle w:val="VerbatimChar"/>
+        </w:rPr>
+        <w:t xml:space="preserve">  stringi_1.8.7          stringr_1.5.2          survival_3.8-3        </w:t>
+      </w:r>
+      <w:r>
+        <w:br/>
+      </w:r>
+      <w:r>
+        <w:rPr>
+          <w:rStyle w:val="VerbatimChar"/>
+        </w:rPr>
+        <w:t xml:space="preserve">  sys_3.4.3              systemfonts_1.2.3      tensorA_0.36.2.1      </w:t>
+      </w:r>
+      <w:r>
+        <w:br/>
+      </w:r>
+      <w:r>
+        <w:rPr>
+          <w:rStyle w:val="VerbatimChar"/>
+        </w:rPr>
+        <w:t xml:space="preserve">  textshaping_1.0.3      TH.data_1.1-4          threejs_0.3.4         </w:t>
+      </w:r>
+      <w:r>
+        <w:br/>
+      </w:r>
+      <w:r>
+        <w:rPr>
+          <w:rStyle w:val="VerbatimChar"/>
+        </w:rPr>
+        <w:t xml:space="preserve">  tibble_3.3.0           tidyr_1.3.1            tidyselect_1.2.1      </w:t>
+      </w:r>
+      <w:r>
+        <w:br/>
+      </w:r>
+      <w:r>
+        <w:rPr>
+          <w:rStyle w:val="VerbatimChar"/>
+        </w:rPr>
+        <w:t xml:space="preserve">  tidyverse_2.0.0        timechange_0.3.0       tinytex_0.57          </w:t>
+      </w:r>
+      <w:r>
+        <w:br/>
+      </w:r>
+      <w:r>
+        <w:rPr>
+          <w:rStyle w:val="VerbatimChar"/>
+        </w:rPr>
+        <w:t xml:space="preserve">  tools_4.5.1            tzdb_0.5.0             ucminf_1.2.2          </w:t>
+      </w:r>
+      <w:r>
+        <w:br/>
+      </w:r>
+      <w:r>
+        <w:rPr>
+          <w:rStyle w:val="VerbatimChar"/>
+        </w:rPr>
+        <w:t xml:space="preserve">  utf8_1.2.6             utils_4.5.1            uuid_1.2.1            </w:t>
+      </w:r>
+      <w:r>
+        <w:br/>
+      </w:r>
+      <w:r>
+        <w:rPr>
+          <w:rStyle w:val="VerbatimChar"/>
+        </w:rPr>
+        <w:t xml:space="preserve">  V8_7.0.0               vctrs_0.6.5            viridisLite_0.4.2     </w:t>
+      </w:r>
+      <w:r>
+        <w:br/>
+      </w:r>
+      <w:r>
+        <w:rPr>
+          <w:rStyle w:val="VerbatimChar"/>
+        </w:rPr>
+        <w:t xml:space="preserve">  vroom_1.6.6            withr_3.0.2            xfun_0.53             </w:t>
+      </w:r>
+      <w:r>
+        <w:br/>
+      </w:r>
+      <w:r>
+        <w:rPr>
+          <w:rStyle w:val="VerbatimChar"/>
+        </w:rPr>
+        <w:t xml:space="preserve">  xml2_1.4.0             xtable_1.8-4           xts_0.14.1            </w:t>
+      </w:r>
+      <w:r>
+        <w:br/>
+      </w:r>
+      <w:r>
+        <w:rPr>
+          <w:rStyle w:val="VerbatimChar"/>
+        </w:rPr>
+        <w:t xml:space="preserve">  yaml_2.3.10            zoo_1.8-14            </w:t>
       </w:r>
     </w:p>
     <w:bookmarkEnd w:id="101"/>

</xml_diff>